<commit_message>
Polish portfolio and Discovery Document for professional client onboarding.
Aligns branding and navigation, adds per-sector JSON downloads, and improves the AI prompt generator for autonomous development from filled discovery files.

Co-authored-by: Cursor <cursoragent@cursor.com>
</commit_message>
<xml_diff>
--- a/discovery-document/output/SwiftWithFer-Discovery-Document.docx
+++ b/discovery-document/output/SwiftWithFer-Discovery-Document.docx
@@ -63,7 +63,7 @@
           <w:color w:val="6B7280"/>
           <w:sz w:val="24"/>
         </w:rPr>
-        <w:t>Project Kick-off &amp; Requirements Analysis</w:t>
+        <w:t>Analisi requisiti per kick-off progetto</w:t>
       </w:r>
     </w:p>
     <w:p/>
@@ -94,7 +94,7 @@
           </w:tcPr>
           <w:p>
             <w:r>
-              <w:t>1.0.0</w:t>
+              <w:t>1.1.0</w:t>
             </w:r>
           </w:p>
         </w:tc>
@@ -6299,7 +6299,7 @@
           <w:i/>
           <w:color w:val="6B7280"/>
         </w:rPr>
-        <w:t>Prompt auto-generato per avviare lo sviluppo in Cursor senza ulteriori domande.</w:t>
+        <w:t>Generato automaticamente dal JSON compilato con generate_cursor_prompt.py — contiene tutti i campi per sviluppo autonomo.</w:t>
       </w:r>
     </w:p>
     <w:p>

</xml_diff>

<commit_message>
Add mandatory consent section to Discovery Document templates.
Append GDPR and material-authorization declarations with acceptance fields to every downloadable format so client intake carries an explicit signed consent trail.

Co-authored-by: Cursor <cursoragent@cursor.com>
</commit_message>
<xml_diff>
--- a/discovery-document/output/SwiftWithFer-Discovery-Document.docx
+++ b/discovery-document/output/SwiftWithFer-Discovery-Document.docx
@@ -94,7 +94,7 @@
           </w:tcPr>
           <w:p>
             <w:r>
-              <w:t>1.1.0</w:t>
+              <w:t>1.2.0</w:t>
             </w:r>
           </w:p>
         </w:tc>
@@ -335,6 +335,14 @@
       </w:pPr>
       <w:r>
         <w:t>17. Prompt Finale Cursor</w:t>
+      </w:r>
+    </w:p>
+    <w:p>
+      <w:pPr>
+        <w:ind w:left="283"/>
+      </w:pPr>
+      <w:r>
+        <w:t>18. Consenso e Accettazione</w:t>
       </w:r>
     </w:p>
     <w:p>
@@ -6342,6 +6350,185 @@
               <w:br/>
               <w:br/>
             </w:r>
+          </w:p>
+        </w:tc>
+      </w:tr>
+    </w:tbl>
+    <w:p>
+      <w:r>
+        <w:br w:type="page"/>
+      </w:r>
+    </w:p>
+    <w:p>
+      <w:pPr>
+        <w:pStyle w:val="Heading1"/>
+      </w:pPr>
+      <w:r>
+        <w:t>18. Consenso e Accettazione</w:t>
+      </w:r>
+    </w:p>
+    <w:p>
+      <w:pPr>
+        <w:pBdr>
+          <w:bottom w:val="single" w:sz="6" w:space="1" w:color="0066FF"/>
+        </w:pBdr>
+      </w:pPr>
+      <w:r>
+        <w:rPr>
+          <w:i/>
+          <w:color w:val="6B7280"/>
+        </w:rPr>
+        <w:t>Sezione obbligatoria. Spunta tutte le dichiarazioni e completa i dati di accettazione prima di inviare il documento. Dichiaro di aver letto e compreso quanto sopra e di accettarne integralmente il contenuto.</w:t>
+      </w:r>
+    </w:p>
+    <w:p>
+      <w:pPr>
+        <w:pStyle w:val="Heading2"/>
+      </w:pPr>
+      <w:r>
+        <w:t>Dichiarazioni di consenso</w:t>
+      </w:r>
+    </w:p>
+    <w:p>
+      <w:r>
+        <w:t>☐ Dichiaro di essere autorizzato a fornire tutti i dati, file, immagini, loghi, contenuti, credenziali e materiali allegati.</w:t>
+      </w:r>
+    </w:p>
+    <w:p>
+      <w:r>
+        <w:t>☐ Autorizzo Fernando Piras ad utilizzare tali dati esclusivamente per analizzare, progettare, sviluppare, testare e consegnare il progetto richiesto.</w:t>
+      </w:r>
+    </w:p>
+    <w:p>
+      <w:r>
+        <w:t>☐ Dichiaro che tutti i dati e materiali forniti sono leciti e non violano diritti di terzi.</w:t>
+      </w:r>
+    </w:p>
+    <w:p>
+      <w:r>
+        <w:t>☐ Acconsento al trattamento dei dati personali ai sensi del Regolamento (UE) 2016/679 (GDPR) esclusivamente per la gestione della richiesta e dello sviluppo del progetto.</w:t>
+      </w:r>
+    </w:p>
+    <w:p>
+      <w:r>
+        <w:t>☐ Dichiaro di aver letto e compreso quanto sopra e di accettarne integralmente il contenuto.</w:t>
+      </w:r>
+    </w:p>
+    <w:p>
+      <w:pPr>
+        <w:pStyle w:val="Heading2"/>
+      </w:pPr>
+      <w:r>
+        <w:t>Dati di accettazione</w:t>
+      </w:r>
+    </w:p>
+    <w:tbl>
+      <w:tblPr>
+        <w:tblStyle w:val="TableGrid"/>
+        <w:tblW w:type="auto" w:w="0"/>
+        <w:tblLook w:firstColumn="1" w:firstRow="1" w:lastColumn="0" w:lastRow="0" w:noHBand="0" w:noVBand="1" w:val="04A0"/>
+      </w:tblPr>
+      <w:tblGrid>
+        <w:gridCol w:w="4703"/>
+        <w:gridCol w:w="4703"/>
+      </w:tblGrid>
+      <w:tr>
+        <w:tc>
+          <w:tcPr>
+            <w:tcW w:type="dxa" w:w="4703"/>
+          </w:tcPr>
+          <w:p>
+            <w:r>
+              <w:t>Nome e Cognome *</w:t>
+            </w:r>
+          </w:p>
+        </w:tc>
+        <w:tc>
+          <w:tcPr>
+            <w:tcW w:type="dxa" w:w="4703"/>
+          </w:tcPr>
+          <w:p>
+            <w:r/>
+          </w:p>
+        </w:tc>
+      </w:tr>
+      <w:tr>
+        <w:tc>
+          <w:tcPr>
+            <w:tcW w:type="dxa" w:w="4703"/>
+          </w:tcPr>
+          <w:p>
+            <w:r>
+              <w:t>Azienda (se presente)</w:t>
+            </w:r>
+          </w:p>
+        </w:tc>
+        <w:tc>
+          <w:tcPr>
+            <w:tcW w:type="dxa" w:w="4703"/>
+          </w:tcPr>
+          <w:p>
+            <w:r/>
+          </w:p>
+        </w:tc>
+      </w:tr>
+      <w:tr>
+        <w:tc>
+          <w:tcPr>
+            <w:tcW w:type="dxa" w:w="4703"/>
+          </w:tcPr>
+          <w:p>
+            <w:r>
+              <w:t>Data *</w:t>
+            </w:r>
+          </w:p>
+        </w:tc>
+        <w:tc>
+          <w:tcPr>
+            <w:tcW w:type="dxa" w:w="4703"/>
+          </w:tcPr>
+          <w:p>
+            <w:r/>
+          </w:p>
+        </w:tc>
+      </w:tr>
+      <w:tr>
+        <w:tc>
+          <w:tcPr>
+            <w:tcW w:type="dxa" w:w="4703"/>
+          </w:tcPr>
+          <w:p>
+            <w:r>
+              <w:t>Luogo *</w:t>
+            </w:r>
+          </w:p>
+        </w:tc>
+        <w:tc>
+          <w:tcPr>
+            <w:tcW w:type="dxa" w:w="4703"/>
+          </w:tcPr>
+          <w:p>
+            <w:r/>
+          </w:p>
+        </w:tc>
+      </w:tr>
+      <w:tr>
+        <w:tc>
+          <w:tcPr>
+            <w:tcW w:type="dxa" w:w="4703"/>
+          </w:tcPr>
+          <w:p>
+            <w:r>
+              <w:t>Firma (o firma digitale) *</w:t>
+            </w:r>
+          </w:p>
+        </w:tc>
+        <w:tc>
+          <w:tcPr>
+            <w:tcW w:type="dxa" w:w="4703"/>
+          </w:tcPr>
+          <w:p>
+            <w:r/>
           </w:p>
         </w:tc>
       </w:tr>

</xml_diff>